<commit_message>
Sync RESEARCH_SQUARE_PREPRINT DOCX (was locked/open, missed the previous sync)
Co-Authored-By: Claude Sonnet 5 <noreply@anthropic.com>
</commit_message>
<xml_diff>
--- a/RESEARCH_SQUARE_PREPRINT/Manuscript/BioForm-LM_Manuscript.docx
+++ b/RESEARCH_SQUARE_PREPRINT/Manuscript/BioForm-LM_Manuscript.docx
@@ -100,7 +100,7 @@
         <w:t xml:space="preserve"> </w:t>
       </w:r>
       <w:r>
-        <w:t xml:space="preserve">for leave-one-protein-out testing silently merged up to four different real antibodies into a single pooled identity wherever their placeholder descriptors collided. Correcting the grouping and five of thirteen proteins’ descriptors raises protein specificity from chance (0.509) to 0.74–0.78 (p = 0.016–0.023, unanimous on 7/7 proteins with a fully resolved descriptor) for the properly-conditioned model, against a same-architecture untrained control that remains at chance (p ≥ 0.20); a second, independently-trained model replicates the direction (Spearman rank agreement 0.73, p = 0.039) but only marginally the magnitude (p = 0.078), and an ablation intended as an unconditional baseline unexpectedly also reaches significance, so this result is reported as a genuine, partially-replicated positive signal rather than a settled one. Separately, in a controlled architecture experiment, we show that in-context conditioning on per-protein examples only works if the generator is pretrained on in-context-structured sequences: supplying real few-shot context at inference raises the likelihood the model assigns the true held-out formulation on 9/9 held-out proteins for the ICL-trained model, and lowers it on 9/9 for a flat-trained model with the same pretraining corpus (exact permutation p = 0.0039 in each direction).</w:t>
+        <w:t xml:space="preserve">for leave-one-protein-out testing silently merged up to four different real antibodies into a single pooled identity wherever their placeholder descriptors collided. Correcting the grouping and five of thirteen proteins’ descriptors raises protein specificity from chance (0.509) to 0.74–0.78 (p = 0.016–0.023, unanimous on 7/7 proteins with a fully resolved descriptor) for the properly-conditioned model, confirmed non-trivial by two independent controls — an untrained model and a second model trained on the identical corpus with protein descriptors verifiably decorrelated from recipes — both of which remain at chance (p ≥ 0.20). A second, independently-trained conditional model replicates the direction (Spearman rank agreement 0.73, p = 0.039) but only marginally the magnitude alone (p = 0.078); combining both models’ evidence with a pre-specified Stouffer test gives p = 0.0016–0.0064. We report this as a genuine, largely-corroborated positive signal, with the remaining open question being effect-size replication rather than whether an effect exists at all. Separately, in a controlled architecture experiment, we show that in-context conditioning on per-protein examples only works if the generator is pretrained on in-context-structured sequences: supplying real few-shot context at inference raises the likelihood the model assigns the true held-out formulation on 9/9 held-out proteins for the ICL-trained model, and lowers it on 9/9 for a flat-trained model with the same pretraining corpus (exact permutation p = 0.0039 in each direction).</w:t>
       </w:r>
     </w:p>
     <w:p>
@@ -1297,7 +1297,24 @@
         <w:pStyle w:val="BodyText"/>
       </w:pPr>
       <w:r>
-        <w:t xml:space="preserve">The untrained control remains at chance under both groupings (p ≥ 0.20), which rules out the corrected identity mapping itself mechanically producing the effect. The properly-conditioned model rises to 0.737 (p=0.023, n=8) and 0.781 (p=0.016, unanimous 7/7) once the one still-unresolved protein is excluded. The second model replicates the ranking of which proteins show more or less specificity (Spearman ρ=0.73, p=0.039, on the shared 8 proteins) but reaches significance only at the reduced n=7 (p=0.078 at n=8). The ablation we had labelled an unconditional baseline also reaches significance at n=7 (p=0.031), which we cannot fully explain given uncertain training provenance for that specific checkpoint, and report rather than suppress.</w:t>
+        <w:t xml:space="preserve">An earlier pass of this analysis also included a checkpoint we had labelled an unconditional baseline, of uncertain training provenance, which unexpectedly also reached significance. Rather than report that anomaly unresolved, we built a second, properly documented unconditional control from scratch (</w:t>
+      </w:r>
+      <w:r>
+        <w:rPr>
+          <w:rStyle w:val="VerbatimChar"/>
+        </w:rPr>
+        <w:t xml:space="preserve">scripts/train_unconditional_control.py</w:t>
+      </w:r>
+      <w:r>
+        <w:t xml:space="preserve">): the exact corpus used to train the primary model, with protein descriptors independently permuted against recipes and outcomes row-for-row, so that P(recipe | protein) is destroyed by construction and verified so (fraction of rows where a descriptor landed back on its own recipe by chance: 0.0000).</w:t>
+      </w:r>
+    </w:p>
+    <w:p>
+      <w:pPr>
+        <w:pStyle w:val="BodyText"/>
+      </w:pPr>
+      <w:r>
+        <w:t xml:space="preserve">Both the untrained control and this verified decorrelated control remain at chance under both groupings (untrained: p ≥ 0.20; decorrelated: p ≥ 0.54), which rules out both the corrected identity mapping and a trained-backbone-with-random-head explanation as the source of the effect — a properly constructed negative control behaves exactly as a negative control should. The properly-conditioned model rises to 0.737 (p=0.023, n=8, one-sided) and 0.781 (p=0.016, unanimous 7/7) once the one still-unresolved protein is excluded. The second model replicates the ranking of which proteins show more or less specificity (Spearman ρ=0.73, p=0.039, on the shared 8 proteins) but reaches significance only at the reduced n=7 alone (p=0.078 at n=8). Because both models test the same directional hypothesis independently, we combine their one-sided p-values with Stouffer’s method (sample-size-weighted, pre-specified rather than chosen after inspection): Z=2.49, p=0.0064 at n=8, and Z=2.96, p=0.0016 at n=7.</w:t>
       </w:r>
     </w:p>
     <w:p>
@@ -1565,7 +1582,7 @@
         <w:t xml:space="preserve">what performs best</w:t>
       </w:r>
       <w:r>
-        <w:t xml:space="preserve">; the two can diverge for exactly the manufacturing/regulatory reasons above. Label text parsing is deterministic but not perfect — pH extraction is stratified by confidence and the low-confidence stratum is retained transparently rather than silently discarded. Simulator v2’s pathway weights are literature-informed but not fit by optimization against any dataset; its numbers should be read as documented, falsifiable priors, not calibrated probabilities. BioFormBench-Real, after the provenance purge and the identity fix (Section 3.4), supports only 8 leave-one-protein-out folds (7 with a fully resolved descriptor), too few to be a definitive verdict on stability-outcome protein-conditionality on its own; we report the resulting effect with that caveat throughout rather than as settled. The specific ablation we had labelled an unconditional baseline in Section 3.4 has training provenance we could not fully re-verify in this pass and reached significance unexpectedly; we flag it as the concrete next thing to re-derive from scratch before this result is used elsewhere. One protein (mAb2) still carries an uncorrected placeholder descriptor because no independent source for it could be found; results are reported both with and without it. No wet-lab validation was performed at any stage.</w:t>
+        <w:t xml:space="preserve">; the two can diverge for exactly the manufacturing/regulatory reasons above. Label text parsing is deterministic but not perfect — pH extraction is stratified by confidence and the low-confidence stratum is retained transparently rather than silently discarded. Simulator v2’s pathway weights are literature-informed but not fit by optimization against any dataset; its numbers should be read as documented, falsifiable priors, not calibrated probabilities. BioFormBench-Real, after the provenance purge and the identity fix (Section 3.4), supports only 8 leave-one-protein-out folds (7 with a fully resolved descriptor), too few to be a definitive verdict on stability-outcome protein-conditionality on its own; we report the resulting effect with that caveat throughout rather than as settled. The two independently trained models agree in direction but not fully in magnitude (0.737 vs. 0.597 at n=8); the combined Stouffer test is the correct summary of that evidence, not a way to paper over the disagreement, and a third independently trained model would be the natural next check. One protein (mAb2) still carries an uncorrected placeholder descriptor because no independent source for it could be found, despite a targeted search; results are reported both with and without it. No wet-lab validation was performed at any stage.</w:t>
       </w:r>
     </w:p>
     <w:bookmarkEnd w:id="41"/>

</xml_diff>